<commit_message>
Add linear functions assignment.
</commit_message>
<xml_diff>
--- a/college_algebra/solving_equations_assignment.docx
+++ b/college_algebra/solving_equations_assignment.docx
@@ -196,6 +196,9 @@
           <w:ilvl w:val="0"/>
           <w:numId w:val="1"/>
         </w:numPr>
+        <w:tabs>
+          <w:tab w:val="left" w:pos="1879"/>
+        </w:tabs>
         <w:rPr>
           <w:rFonts w:eastAsiaTheme="minorEastAsia"/>
         </w:rPr>
@@ -248,7 +251,7 @@
     <w:p>
       <w:pPr>
         <w:tabs>
-          <w:tab w:val="left" w:pos="1879"/>
+          <w:tab w:val="left" w:pos="2599"/>
         </w:tabs>
       </w:pPr>
       <w:r>

</xml_diff>